<commit_message>
add link figma in Dev Note Shela
</commit_message>
<xml_diff>
--- a/dev note/Dev Note 1 - Shela.docx
+++ b/dev note/Dev Note 1 - Shela.docx
@@ -61,6 +61,23 @@
           <w:rtl w:val="0"/>
         </w:rPr>
         <w:t xml:space="preserve">Figma: </w:t>
+      </w:r>
+      <w:hyperlink r:id="rId6">
+        <w:r>
+          <w:rPr>
+            <w:color w:val="1155cc"/>
+            <w:sz w:val="24"/>
+            <w:szCs w:val="24"/>
+            <w:u w:val="single"/>
+            <w:rtl w:val="0"/>
+          </w:rPr>
+          <w:t xml:space="preserve">https://www.figma.com/design/FDUYXur8h4EL9AmjRymZax/Next-kickstart?node-id=0-1&amp;t=NI9tcUJgPZBOmu7o-1</w:t>
+        </w:r>
+      </w:hyperlink>
+      <w:r>
+        <w:rPr>
+          <w:rtl w:val="0"/>
+        </w:rPr>
       </w:r>
     </w:p>
     <w:p>
@@ -89,7 +106,7 @@
                     <pic:cNvPicPr preferRelativeResize="0"/>
                   </pic:nvPicPr>
                   <pic:blipFill>
-                    <a:blip r:embed="rId6"/>
+                    <a:blip r:embed="rId7"/>
                     <a:srcRect b="0" l="0" r="0" t="0"/>
                     <a:stretch>
                       <a:fillRect/>
@@ -218,7 +235,7 @@
                           <pic:cNvPicPr preferRelativeResize="0"/>
                         </pic:nvPicPr>
                         <pic:blipFill>
-                          <a:blip r:embed="rId7"/>
+                          <a:blip r:embed="rId8"/>
                           <a:srcRect b="0" l="0" r="0" t="0"/>
                           <a:stretch>
                             <a:fillRect/>
@@ -280,16 +297,16 @@
                 <wp:inline distB="114300" distT="114300" distL="114300" distR="114300">
                   <wp:extent cx="2266950" cy="1485900"/>
                   <wp:effectExtent b="0" l="0" r="0" t="0"/>
-                  <wp:docPr id="5" name="image4.png"/>
+                  <wp:docPr id="5" name="image7.png"/>
                   <a:graphic>
                     <a:graphicData uri="http://schemas.openxmlformats.org/drawingml/2006/picture">
                       <pic:pic>
                         <pic:nvPicPr>
-                          <pic:cNvPr id="0" name="image4.png"/>
+                          <pic:cNvPr id="0" name="image7.png"/>
                           <pic:cNvPicPr preferRelativeResize="0"/>
                         </pic:nvPicPr>
                         <pic:blipFill>
-                          <a:blip r:embed="rId8"/>
+                          <a:blip r:embed="rId9"/>
                           <a:srcRect b="0" l="0" r="0" t="0"/>
                           <a:stretch>
                             <a:fillRect/>
@@ -345,16 +362,16 @@
                 <wp:inline distB="114300" distT="114300" distL="114300" distR="114300">
                   <wp:extent cx="1998113" cy="1309688"/>
                   <wp:effectExtent b="0" l="0" r="0" t="0"/>
-                  <wp:docPr id="6" name="image5.png"/>
+                  <wp:docPr id="6" name="image4.png"/>
                   <a:graphic>
                     <a:graphicData uri="http://schemas.openxmlformats.org/drawingml/2006/picture">
                       <pic:pic>
                         <pic:nvPicPr>
-                          <pic:cNvPr id="0" name="image5.png"/>
+                          <pic:cNvPr id="0" name="image4.png"/>
                           <pic:cNvPicPr preferRelativeResize="0"/>
                         </pic:nvPicPr>
                         <pic:blipFill>
-                          <a:blip r:embed="rId9"/>
+                          <a:blip r:embed="rId10"/>
                           <a:srcRect b="0" l="0" r="0" t="0"/>
                           <a:stretch>
                             <a:fillRect/>
@@ -416,16 +433,16 @@
                 <wp:inline distB="114300" distT="114300" distL="114300" distR="114300">
                   <wp:extent cx="2266950" cy="1155700"/>
                   <wp:effectExtent b="0" l="0" r="0" t="0"/>
-                  <wp:docPr id="8" name="image8.png"/>
+                  <wp:docPr id="8" name="image9.png"/>
                   <a:graphic>
                     <a:graphicData uri="http://schemas.openxmlformats.org/drawingml/2006/picture">
                       <pic:pic>
                         <pic:nvPicPr>
-                          <pic:cNvPr id="0" name="image8.png"/>
+                          <pic:cNvPr id="0" name="image9.png"/>
                           <pic:cNvPicPr preferRelativeResize="0"/>
                         </pic:nvPicPr>
                         <pic:blipFill>
-                          <a:blip r:embed="rId10"/>
+                          <a:blip r:embed="rId11"/>
                           <a:srcRect b="0" l="0" r="0" t="0"/>
                           <a:stretch>
                             <a:fillRect/>
@@ -481,16 +498,16 @@
                 <wp:inline distB="114300" distT="114300" distL="114300" distR="114300">
                   <wp:extent cx="2054774" cy="1027387"/>
                   <wp:effectExtent b="0" l="0" r="0" t="0"/>
-                  <wp:docPr id="1" name="image10.png"/>
+                  <wp:docPr id="1" name="image6.png"/>
                   <a:graphic>
                     <a:graphicData uri="http://schemas.openxmlformats.org/drawingml/2006/picture">
                       <pic:pic>
                         <pic:nvPicPr>
-                          <pic:cNvPr id="0" name="image10.png"/>
+                          <pic:cNvPr id="0" name="image6.png"/>
                           <pic:cNvPicPr preferRelativeResize="0"/>
                         </pic:nvPicPr>
                         <pic:blipFill>
-                          <a:blip r:embed="rId11"/>
+                          <a:blip r:embed="rId12"/>
                           <a:srcRect b="0" l="0" r="0" t="0"/>
                           <a:stretch>
                             <a:fillRect/>
@@ -552,16 +569,16 @@
                 <wp:inline distB="114300" distT="114300" distL="114300" distR="114300">
                   <wp:extent cx="2266950" cy="1384300"/>
                   <wp:effectExtent b="0" l="0" r="0" t="0"/>
-                  <wp:docPr id="7" name="image7.png"/>
+                  <wp:docPr id="7" name="image3.png"/>
                   <a:graphic>
                     <a:graphicData uri="http://schemas.openxmlformats.org/drawingml/2006/picture">
                       <pic:pic>
                         <pic:nvPicPr>
-                          <pic:cNvPr id="0" name="image7.png"/>
+                          <pic:cNvPr id="0" name="image3.png"/>
                           <pic:cNvPicPr preferRelativeResize="0"/>
                         </pic:nvPicPr>
                         <pic:blipFill>
-                          <a:blip r:embed="rId12"/>
+                          <a:blip r:embed="rId13"/>
                           <a:srcRect b="0" l="0" r="0" t="0"/>
                           <a:stretch>
                             <a:fillRect/>
@@ -617,16 +634,16 @@
                 <wp:inline distB="114300" distT="114300" distL="114300" distR="114300">
                   <wp:extent cx="1899856" cy="1221336"/>
                   <wp:effectExtent b="0" l="0" r="0" t="0"/>
-                  <wp:docPr id="4" name="image3.png"/>
+                  <wp:docPr id="4" name="image8.png"/>
                   <a:graphic>
                     <a:graphicData uri="http://schemas.openxmlformats.org/drawingml/2006/picture">
                       <pic:pic>
                         <pic:nvPicPr>
-                          <pic:cNvPr id="0" name="image3.png"/>
+                          <pic:cNvPr id="0" name="image8.png"/>
                           <pic:cNvPicPr preferRelativeResize="0"/>
                         </pic:nvPicPr>
                         <pic:blipFill>
-                          <a:blip r:embed="rId13"/>
+                          <a:blip r:embed="rId14"/>
                           <a:srcRect b="0" l="0" r="0" t="0"/>
                           <a:stretch>
                             <a:fillRect/>
@@ -688,16 +705,16 @@
                 <wp:inline distB="114300" distT="114300" distL="114300" distR="114300">
                   <wp:extent cx="2266950" cy="1282700"/>
                   <wp:effectExtent b="0" l="0" r="0" t="0"/>
-                  <wp:docPr id="3" name="image9.png"/>
+                  <wp:docPr id="3" name="image10.png"/>
                   <a:graphic>
                     <a:graphicData uri="http://schemas.openxmlformats.org/drawingml/2006/picture">
                       <pic:pic>
                         <pic:nvPicPr>
-                          <pic:cNvPr id="0" name="image9.png"/>
+                          <pic:cNvPr id="0" name="image10.png"/>
                           <pic:cNvPicPr preferRelativeResize="0"/>
                         </pic:nvPicPr>
                         <pic:blipFill>
-                          <a:blip r:embed="rId14"/>
+                          <a:blip r:embed="rId15"/>
                           <a:srcRect b="0" l="0" r="0" t="0"/>
                           <a:stretch>
                             <a:fillRect/>
@@ -938,16 +955,16 @@
           <wp:inline distB="114300" distT="114300" distL="114300" distR="114300">
             <wp:extent cx="1733550" cy="438150"/>
             <wp:effectExtent b="0" l="0" r="0" t="0"/>
-            <wp:docPr id="10" name="image6.png"/>
+            <wp:docPr id="10" name="image5.png"/>
             <a:graphic>
               <a:graphicData uri="http://schemas.openxmlformats.org/drawingml/2006/picture">
                 <pic:pic>
                   <pic:nvPicPr>
-                    <pic:cNvPr id="0" name="image6.png"/>
+                    <pic:cNvPr id="0" name="image5.png"/>
                     <pic:cNvPicPr preferRelativeResize="0"/>
                   </pic:nvPicPr>
                   <pic:blipFill>
-                    <a:blip r:embed="rId15"/>
+                    <a:blip r:embed="rId16"/>
                     <a:srcRect b="71976" l="34717" r="35049" t="14454"/>
                     <a:stretch>
                       <a:fillRect/>

</xml_diff>